<commit_message>
final report (for revision)
</commit_message>
<xml_diff>
--- a/LupaDigital_hugoverissimo.docx
+++ b/LupaDigital_hugoverissimo.docx
@@ -133,75 +133,6 @@
         </w:rPr>
         <w:t>Lupa Digital</w:t>
       </w:r>
-      <w:r>
-        <w:rPr>
-          <w:color w:val="auto"/>
-          <w:lang w:val="pt-PT"/>
-        </w:rPr>
-        <w:t xml:space="preserve"> </w:t>
-      </w:r>
-      <w:r>
-        <w:rPr>
-          <w:color w:val="auto"/>
-          <w:highlight w:val="green"/>
-          <w:lang w:val="pt-PT"/>
-        </w:rPr>
-        <w:t xml:space="preserve">[REVER: </w:t>
-      </w:r>
-      <w:proofErr w:type="spellStart"/>
-      <w:r>
-        <w:rPr>
-          <w:color w:val="auto"/>
-          <w:highlight w:val="green"/>
-          <w:lang w:val="pt-PT"/>
-        </w:rPr>
-        <w:t>max</w:t>
-      </w:r>
-      <w:proofErr w:type="spellEnd"/>
-      <w:r>
-        <w:rPr>
-          <w:color w:val="auto"/>
-          <w:highlight w:val="green"/>
-          <w:lang w:val="pt-PT"/>
-        </w:rPr>
-        <w:t xml:space="preserve"> 2k </w:t>
-      </w:r>
-      <w:proofErr w:type="spellStart"/>
-      <w:r>
-        <w:rPr>
-          <w:color w:val="auto"/>
-          <w:highlight w:val="green"/>
-          <w:lang w:val="pt-PT"/>
-        </w:rPr>
-        <w:t>words</w:t>
-      </w:r>
-      <w:proofErr w:type="spellEnd"/>
-      <w:r>
-        <w:rPr>
-          <w:color w:val="auto"/>
-          <w:highlight w:val="green"/>
-          <w:lang w:val="pt-PT"/>
-        </w:rPr>
-        <w:t xml:space="preserve">, </w:t>
-      </w:r>
-      <w:proofErr w:type="spellStart"/>
-      <w:r>
-        <w:rPr>
-          <w:color w:val="auto"/>
-          <w:highlight w:val="green"/>
-          <w:lang w:val="pt-PT"/>
-        </w:rPr>
-        <w:t>max</w:t>
-      </w:r>
-      <w:proofErr w:type="spellEnd"/>
-      <w:r>
-        <w:rPr>
-          <w:color w:val="auto"/>
-          <w:highlight w:val="green"/>
-          <w:lang w:val="pt-PT"/>
-        </w:rPr>
-        <w:t xml:space="preserve"> 10MB, tudo]</w:t>
-      </w:r>
     </w:p>
     <w:p>
       <w:pPr>
@@ -303,6 +234,19 @@
     </w:p>
     <w:p>
       <w:pPr>
+        <w:ind w:left="0" w:firstLine="0"/>
+        <w:contextualSpacing w:val="0"/>
+        <w:jc w:val="both"/>
+        <w:rPr>
+          <w:color w:val="auto"/>
+          <w:lang w:val="pt-PT"/>
+        </w:rPr>
+      </w:pPr>
+      <w:bookmarkStart w:id="4" w:name="_2nufka4gwvkw" w:colFirst="0" w:colLast="0"/>
+      <w:bookmarkEnd w:id="4"/>
+    </w:p>
+    <w:p>
+      <w:pPr>
         <w:pStyle w:val="Heading1"/>
         <w:ind w:left="0" w:firstLine="0"/>
         <w:contextualSpacing w:val="0"/>
@@ -311,8 +255,6 @@
           <w:lang w:val="pt-PT"/>
         </w:rPr>
       </w:pPr>
-      <w:bookmarkStart w:id="4" w:name="_2nufka4gwvkw" w:colFirst="0" w:colLast="0"/>
-      <w:bookmarkEnd w:id="4"/>
       <w:r>
         <w:rPr>
           <w:color w:val="auto"/>
@@ -408,7 +350,7 @@
           <w:color w:val="auto"/>
           <w:lang w:val="pt-PT"/>
         </w:rPr>
-        <w:t>torna</w:t>
+        <w:t>permite</w:t>
       </w:r>
       <w:r>
         <w:rPr>
@@ -424,14 +366,6 @@
           <w:color w:val="auto"/>
           <w:lang w:val="pt-PT"/>
         </w:rPr>
-        <w:t xml:space="preserve">possível </w:t>
-      </w:r>
-      <w:r>
-        <w:rPr>
-          <w:iCs/>
-          <w:color w:val="auto"/>
-          <w:lang w:val="pt-PT"/>
-        </w:rPr>
         <w:t>a análise</w:t>
       </w:r>
       <w:r>
@@ -440,15 +374,15 @@
           <w:color w:val="auto"/>
           <w:lang w:val="pt-PT"/>
         </w:rPr>
-        <w:t xml:space="preserve"> e </w:t>
-      </w:r>
-      <w:r>
-        <w:rPr>
-          <w:iCs/>
-          <w:color w:val="auto"/>
-          <w:lang w:val="pt-PT"/>
-        </w:rPr>
-        <w:t>exploração de</w:t>
+        <w:t xml:space="preserve"> </w:t>
+      </w:r>
+      <w:r>
+        <w:rPr>
+          <w:iCs/>
+          <w:color w:val="auto"/>
+          <w:lang w:val="pt-PT"/>
+        </w:rPr>
+        <w:t>de</w:t>
       </w:r>
       <w:r>
         <w:rPr>
@@ -1029,19 +963,6 @@
       <w:pPr>
         <w:ind w:left="0" w:firstLine="0"/>
         <w:contextualSpacing w:val="0"/>
-        <w:jc w:val="both"/>
-        <w:rPr>
-          <w:color w:val="auto"/>
-          <w:sz w:val="18"/>
-          <w:szCs w:val="18"/>
-          <w:lang w:val="pt-PT"/>
-        </w:rPr>
-      </w:pPr>
-    </w:p>
-    <w:p>
-      <w:pPr>
-        <w:ind w:left="0" w:firstLine="0"/>
-        <w:contextualSpacing w:val="0"/>
         <w:jc w:val="center"/>
         <w:rPr>
           <w:noProof/>
@@ -1337,7 +1258,7 @@
           <w:iCs w:val="0"/>
           <w:lang w:val="pt-PT"/>
         </w:rPr>
-        <w:t xml:space="preserve">Exemplos da interface da plataforma Lupa Digital, ilustrando as principais funcionalidades: pesquisa por tópicos (ex.: “Covid-19”), visualização da evolução temporal da cobertura mediática e dos </w:t>
+        <w:t xml:space="preserve">Exemplos da interface da plataforma Lupa Digital, ilustrando as principais funcionalidades: pesquisa por tópicos (ex.: “Covid-19”), visualização da evolução da cobertura mediática e dos </w:t>
       </w:r>
       <w:r>
         <w:rPr>
@@ -1377,7 +1298,7 @@
           <w:iCs w:val="0"/>
           <w:lang w:val="pt-PT"/>
         </w:rPr>
-        <w:t>ou</w:t>
+        <w:t>e</w:t>
       </w:r>
       <w:r>
         <w:rPr>
@@ -1510,65 +1431,81 @@
           <w:color w:val="auto"/>
           <w:lang w:val="pt-PT"/>
         </w:rPr>
+        <w:t>Permitir que qualquer utilizador, de forma simples, consiga pesquisar um tópico à sua escolha e</w:t>
+      </w:r>
+      <w:r>
+        <w:rPr>
+          <w:iCs/>
+          <w:color w:val="auto"/>
+          <w:lang w:val="pt-PT"/>
+        </w:rPr>
+        <w:t>,</w:t>
+      </w:r>
+      <w:r>
+        <w:rPr>
+          <w:iCs/>
+          <w:color w:val="auto"/>
+          <w:lang w:val="pt-PT"/>
+        </w:rPr>
+        <w:t xml:space="preserve"> </w:t>
+      </w:r>
+      <w:r>
+        <w:rPr>
+          <w:iCs/>
+          <w:color w:val="auto"/>
+          <w:lang w:val="pt-PT"/>
+        </w:rPr>
+        <w:t>a partir dos resultados</w:t>
+      </w:r>
+      <w:r>
+        <w:rPr>
+          <w:iCs/>
+          <w:color w:val="auto"/>
+          <w:lang w:val="pt-PT"/>
+        </w:rPr>
+        <w:t xml:space="preserve"> obtidos</w:t>
+      </w:r>
+      <w:r>
+        <w:rPr>
+          <w:iCs/>
+          <w:color w:val="auto"/>
+          <w:lang w:val="pt-PT"/>
+        </w:rPr>
+        <w:t>,</w:t>
+      </w:r>
+      <w:r>
+        <w:rPr>
+          <w:iCs/>
+          <w:color w:val="auto"/>
+          <w:lang w:val="pt-PT"/>
+        </w:rPr>
+        <w:t xml:space="preserve"> consiga ter uma perceção em relação a como</w:t>
+      </w:r>
+      <w:bookmarkStart w:id="5" w:name="_Hlk195344576"/>
+      <w:r>
+        <w:rPr>
+          <w:iCs/>
+          <w:color w:val="auto"/>
+          <w:lang w:val="pt-PT"/>
+        </w:rPr>
+        <w:t xml:space="preserve"> </w:t>
+      </w:r>
+      <w:r>
+        <w:rPr>
+          <w:iCs/>
+          <w:color w:val="auto"/>
+          <w:lang w:val="pt-PT"/>
+        </w:rPr>
+        <w:t xml:space="preserve">os media </w:t>
+      </w:r>
+      <w:r>
+        <w:rPr>
+          <w:iCs/>
+          <w:color w:val="auto"/>
+          <w:lang w:val="pt-PT"/>
+        </w:rPr>
         <w:lastRenderedPageBreak/>
-        <w:t>Permitir que qualquer utilizador, de forma simples e rápida, consiga pesquisar um tópico à sua escolha e</w:t>
-      </w:r>
-      <w:r>
-        <w:rPr>
-          <w:iCs/>
-          <w:color w:val="auto"/>
-          <w:lang w:val="pt-PT"/>
-        </w:rPr>
-        <w:t>,</w:t>
-      </w:r>
-      <w:r>
-        <w:rPr>
-          <w:iCs/>
-          <w:color w:val="auto"/>
-          <w:lang w:val="pt-PT"/>
-        </w:rPr>
-        <w:t xml:space="preserve"> </w:t>
-      </w:r>
-      <w:r>
-        <w:rPr>
-          <w:iCs/>
-          <w:color w:val="auto"/>
-          <w:lang w:val="pt-PT"/>
-        </w:rPr>
-        <w:t>a partir dos resultados dessa pesquisa</w:t>
-      </w:r>
-      <w:r>
-        <w:rPr>
-          <w:iCs/>
-          <w:color w:val="auto"/>
-          <w:lang w:val="pt-PT"/>
-        </w:rPr>
-        <w:t>,</w:t>
-      </w:r>
-      <w:r>
-        <w:rPr>
-          <w:iCs/>
-          <w:color w:val="auto"/>
-          <w:lang w:val="pt-PT"/>
-        </w:rPr>
-        <w:t xml:space="preserve"> consiga ter uma perceção em relação a como</w:t>
-      </w:r>
-      <w:bookmarkStart w:id="5" w:name="_Hlk195344576"/>
-      <w:r>
-        <w:rPr>
-          <w:iCs/>
-          <w:color w:val="auto"/>
-          <w:lang w:val="pt-PT"/>
-        </w:rPr>
-        <w:t xml:space="preserve"> </w:t>
-      </w:r>
-      <w:r>
-        <w:rPr>
-          <w:iCs/>
-          <w:color w:val="auto"/>
-          <w:lang w:val="pt-PT"/>
-        </w:rPr>
-        <w:t xml:space="preserve">os media portugueses </w:t>
+        <w:t xml:space="preserve">portugueses </w:t>
       </w:r>
       <w:bookmarkEnd w:id="5"/>
       <w:r>
@@ -1629,7 +1566,23 @@
           <w:color w:val="auto"/>
           <w:lang w:val="pt-PT"/>
         </w:rPr>
-        <w:t xml:space="preserve">Revelar ligações entre qualquer par de tópicos, sejam eles entidades, eventos ou temas, e, por conseguinte, permitir ao utilizador ter uma perceção sobre a relação, </w:t>
+        <w:t xml:space="preserve">Revelar ligações entre qualquer par de tópicos, sejam eles entidades, eventos ou temas, </w:t>
+      </w:r>
+      <w:r>
+        <w:rPr>
+          <w:iCs/>
+          <w:color w:val="auto"/>
+          <w:lang w:val="pt-PT"/>
+        </w:rPr>
+        <w:t>permitindo o</w:t>
+      </w:r>
+      <w:r>
+        <w:rPr>
+          <w:iCs/>
+          <w:color w:val="auto"/>
+          <w:lang w:val="pt-PT"/>
+        </w:rPr>
+        <w:t xml:space="preserve"> utilizador ter uma perceção sobre a relação, </w:t>
       </w:r>
       <w:r>
         <w:rPr>
@@ -2188,31 +2141,7 @@
             <w:iCs/>
             <w:lang w:val="pt-PT"/>
           </w:rPr>
-          <w:t>lupa-digit</w:t>
-        </w:r>
-        <w:r>
-          <w:rPr>
-            <w:rStyle w:val="Hyperlink"/>
-            <w:iCs/>
-            <w:lang w:val="pt-PT"/>
-          </w:rPr>
-          <w:t>a</w:t>
-        </w:r>
-        <w:r>
-          <w:rPr>
-            <w:rStyle w:val="Hyperlink"/>
-            <w:iCs/>
-            <w:lang w:val="pt-PT"/>
-          </w:rPr>
-          <w:t>l</w:t>
-        </w:r>
-        <w:r>
-          <w:rPr>
-            <w:rStyle w:val="Hyperlink"/>
-            <w:iCs/>
-            <w:lang w:val="pt-PT"/>
-          </w:rPr>
-          <w:t>.pt</w:t>
+          <w:t>lupa-digital.pt</w:t>
         </w:r>
       </w:hyperlink>
       <w:r>
@@ -2317,7 +2246,39 @@
           <w:color w:val="auto"/>
           <w:lang w:val="pt-PT"/>
         </w:rPr>
-        <w:t xml:space="preserve"> tópico, o utilizador terá acesso </w:t>
+        <w:t xml:space="preserve"> tópico, o utilizador terá acesso a várias visualizações</w:t>
+      </w:r>
+      <w:r>
+        <w:rPr>
+          <w:iCs/>
+          <w:color w:val="auto"/>
+          <w:lang w:val="pt-PT"/>
+        </w:rPr>
+        <w:t xml:space="preserve"> </w:t>
+      </w:r>
+      <w:r>
+        <w:rPr>
+          <w:iCs/>
+          <w:color w:val="auto"/>
+          <w:lang w:val="pt-PT"/>
+        </w:rPr>
+        <w:t xml:space="preserve">e informações relacionadas com a pesquisa, podendo, de forma intuitiva, analisar criticamente as relações </w:t>
+      </w:r>
+      <w:r>
+        <w:rPr>
+          <w:iCs/>
+          <w:color w:val="auto"/>
+          <w:lang w:val="pt-PT"/>
+        </w:rPr>
+        <w:t>com outros tópicos</w:t>
+      </w:r>
+      <w:r>
+        <w:rPr>
+          <w:iCs/>
+          <w:color w:val="auto"/>
+          <w:lang w:val="pt-PT"/>
+        </w:rPr>
+        <w:t xml:space="preserve">, como é que a perceção do tópico </w:t>
       </w:r>
       <w:r>
         <w:rPr>
@@ -2326,46 +2287,6 @@
           <w:lang w:val="pt-PT"/>
         </w:rPr>
         <w:lastRenderedPageBreak/>
-        <w:t>a várias visualizações</w:t>
-      </w:r>
-      <w:r>
-        <w:rPr>
-          <w:iCs/>
-          <w:color w:val="auto"/>
-          <w:lang w:val="pt-PT"/>
-        </w:rPr>
-        <w:t xml:space="preserve"> </w:t>
-      </w:r>
-      <w:r>
-        <w:rPr>
-          <w:iCs/>
-          <w:color w:val="auto"/>
-          <w:lang w:val="pt-PT"/>
-        </w:rPr>
-        <w:t xml:space="preserve">e informações relacionadas com a pesquisa, podendo, de forma intuitiva, analisar criticamente as relações </w:t>
-      </w:r>
-      <w:r>
-        <w:rPr>
-          <w:iCs/>
-          <w:color w:val="auto"/>
-          <w:lang w:val="pt-PT"/>
-        </w:rPr>
-        <w:t>com outros tópicos</w:t>
-      </w:r>
-      <w:r>
-        <w:rPr>
-          <w:iCs/>
-          <w:color w:val="auto"/>
-          <w:lang w:val="pt-PT"/>
-        </w:rPr>
-        <w:t xml:space="preserve">, como é que a perceção do tópico </w:t>
-      </w:r>
-      <w:r>
-        <w:rPr>
-          <w:iCs/>
-          <w:color w:val="auto"/>
-          <w:lang w:val="pt-PT"/>
-        </w:rPr>
         <w:t xml:space="preserve">pesquisado </w:t>
       </w:r>
       <w:r>
@@ -2736,15 +2657,15 @@
           <w:color w:val="auto"/>
           <w:lang w:val="pt-PT"/>
         </w:rPr>
-        <w:t xml:space="preserve"> Estas visualizações gráficas incluem um grafo interativo </w:t>
-      </w:r>
-      <w:r>
-        <w:rPr>
-          <w:iCs/>
-          <w:color w:val="auto"/>
-          <w:lang w:val="pt-PT"/>
-        </w:rPr>
-        <w:t>que revela como diferentes tópicos se interligam ao tópico pesquisado e</w:t>
+        <w:t xml:space="preserve"> Estas visualizações incluem um grafo interativo </w:t>
+      </w:r>
+      <w:r>
+        <w:rPr>
+          <w:iCs/>
+          <w:color w:val="auto"/>
+          <w:lang w:val="pt-PT"/>
+        </w:rPr>
+        <w:t>que revela como tópicos se interligam ao pesquisado e</w:t>
       </w:r>
       <w:r>
         <w:rPr>
@@ -2784,7 +2705,7 @@
           <w:color w:val="auto"/>
           <w:lang w:val="pt-PT"/>
         </w:rPr>
-        <w:t>permite que o</w:t>
+        <w:t>o</w:t>
       </w:r>
       <w:r>
         <w:rPr>
@@ -2800,7 +2721,7 @@
           <w:color w:val="auto"/>
           <w:lang w:val="pt-PT"/>
         </w:rPr>
-        <w:t>obtenha</w:t>
+        <w:t>obtém</w:t>
       </w:r>
       <w:r>
         <w:rPr>
@@ -2977,16 +2898,7 @@
           <w:color w:val="auto"/>
           <w:lang w:val="pt-PT"/>
         </w:rPr>
-        <w:t xml:space="preserve">no âmbito da mineração </w:t>
-      </w:r>
-      <w:r>
-        <w:rPr>
-          <w:iCs/>
-          <w:color w:val="auto"/>
-          <w:lang w:val="pt-PT"/>
-        </w:rPr>
-        <w:lastRenderedPageBreak/>
-        <w:t>de dados em notícias</w:t>
+        <w:t>no âmbito da mineração de dados em notícias</w:t>
       </w:r>
       <w:r>
         <w:rPr>
@@ -3062,6 +2974,7 @@
           <w:color w:val="auto"/>
           <w:lang w:val="pt-PT"/>
         </w:rPr>
+        <w:lastRenderedPageBreak/>
         <w:t>Impacto social (aplicação e utilidade social)</w:t>
       </w:r>
     </w:p>
@@ -3122,7 +3035,23 @@
           <w:color w:val="auto"/>
           <w:lang w:val="pt-PT"/>
         </w:rPr>
-        <w:t xml:space="preserve"> pelo facto de disponibilizar uma ferramenta inovadora que permite aos mesmos explorar e compreender a evolução de um tópico do seu interesse no contexto da informação jornalística</w:t>
+        <w:t xml:space="preserve"> </w:t>
+      </w:r>
+      <w:r>
+        <w:rPr>
+          <w:iCs/>
+          <w:color w:val="auto"/>
+          <w:lang w:val="pt-PT"/>
+        </w:rPr>
+        <w:t>ao</w:t>
+      </w:r>
+      <w:r>
+        <w:rPr>
+          <w:iCs/>
+          <w:color w:val="auto"/>
+          <w:lang w:val="pt-PT"/>
+        </w:rPr>
+        <w:t xml:space="preserve"> disponibilizar uma ferramenta inovadora que permite aos mesmos explorar e compreender a evolução de um tópico do seu interesse no contexto da informação jornalística</w:t>
       </w:r>
       <w:r>
         <w:rPr>
@@ -3378,7 +3307,39 @@
           <w:color w:val="auto"/>
           <w:lang w:val="pt-PT"/>
         </w:rPr>
-        <w:t xml:space="preserve">elo facto de ter desenvolvido, para além de uma ferramenta inovadora para a análise de grandes volumes de notícias arquivadas, um conjunto de dados </w:t>
+        <w:t xml:space="preserve">elo </w:t>
+      </w:r>
+      <w:r>
+        <w:rPr>
+          <w:iCs/>
+          <w:color w:val="auto"/>
+          <w:lang w:val="pt-PT"/>
+        </w:rPr>
+        <w:t>desenvolvimento</w:t>
+      </w:r>
+      <w:r>
+        <w:rPr>
+          <w:iCs/>
+          <w:color w:val="auto"/>
+          <w:lang w:val="pt-PT"/>
+        </w:rPr>
+        <w:t xml:space="preserve">, para além de uma ferramenta inovadora para a análise de grandes volumes de notícias arquivadas, </w:t>
+      </w:r>
+      <w:r>
+        <w:rPr>
+          <w:iCs/>
+          <w:color w:val="auto"/>
+          <w:lang w:val="pt-PT"/>
+        </w:rPr>
+        <w:t xml:space="preserve">de </w:t>
+      </w:r>
+      <w:r>
+        <w:rPr>
+          <w:iCs/>
+          <w:color w:val="auto"/>
+          <w:lang w:val="pt-PT"/>
+        </w:rPr>
+        <w:t xml:space="preserve">um conjunto de dados </w:t>
       </w:r>
       <w:r>
         <w:rPr>
@@ -3466,7 +3427,7 @@
           <w:color w:val="auto"/>
           <w:lang w:val="pt-PT"/>
         </w:rPr>
-        <w:t xml:space="preserve">investigadores da área de Processamento de Linguagem Natural (NLP) e </w:t>
+        <w:t xml:space="preserve">investigadores da área de Processamento de Linguagem Natural e </w:t>
       </w:r>
       <w:r>
         <w:rPr>
@@ -3602,16 +3563,7 @@
           <w:color w:val="auto"/>
           <w:lang w:val="pt-PT"/>
         </w:rPr>
-        <w:t xml:space="preserve">. Estes métodos podem ser </w:t>
-      </w:r>
-      <w:r>
-        <w:rPr>
-          <w:iCs/>
-          <w:color w:val="auto"/>
-          <w:lang w:val="pt-PT"/>
-        </w:rPr>
-        <w:lastRenderedPageBreak/>
-        <w:t>aplicados e aprimorados em pesquisas</w:t>
+        <w:t>. Estes métodos podem ser aplicados e aprimorados em pesquisas</w:t>
       </w:r>
       <w:r>
         <w:rPr>
@@ -3649,6 +3601,7 @@
           <w:color w:val="auto"/>
           <w:lang w:val="pt-PT"/>
         </w:rPr>
+        <w:lastRenderedPageBreak/>
         <w:t>Importa ainda referir a partilha integral da metodologia e do código-fonte do projeto, disponível em</w:t>
       </w:r>
       <w:r>
@@ -3696,6 +3649,18 @@
     </w:p>
     <w:p>
       <w:pPr>
+        <w:ind w:left="0" w:firstLine="0"/>
+        <w:contextualSpacing w:val="0"/>
+        <w:jc w:val="both"/>
+        <w:rPr>
+          <w:iCs/>
+          <w:color w:val="auto"/>
+          <w:lang w:val="pt-PT"/>
+        </w:rPr>
+      </w:pPr>
+    </w:p>
+    <w:p>
+      <w:pPr>
         <w:pStyle w:val="Heading1"/>
         <w:ind w:left="0" w:firstLine="0"/>
         <w:contextualSpacing w:val="0"/>
@@ -3835,7 +3800,7 @@
           <w:color w:val="auto"/>
           <w:lang w:val="pt-PT"/>
         </w:rPr>
-        <w:t xml:space="preserve"> a importância do Arquivo.pt no desenvolvimento deste projeto, sendo como uma fundação para a criação do conjunto de dados criado e por sua vez para a aplicação </w:t>
+        <w:t xml:space="preserve"> a importância do Arquivo.pt no desenvolvimento deste projeto, sendo como uma fundação para a criação do conjunto de dados e por sua vez para a aplicação </w:t>
       </w:r>
       <w:r>
         <w:rPr>
@@ -3893,18 +3858,6 @@
         </w:rPr>
         <w:t>mesmo depois de descontinuados.</w:t>
       </w:r>
-    </w:p>
-    <w:p>
-      <w:pPr>
-        <w:ind w:left="0" w:firstLine="0"/>
-        <w:contextualSpacing w:val="0"/>
-        <w:jc w:val="both"/>
-        <w:rPr>
-          <w:iCs/>
-          <w:color w:val="auto"/>
-          <w:lang w:val="pt-PT"/>
-        </w:rPr>
-      </w:pPr>
     </w:p>
     <w:p>
       <w:pPr>
@@ -4170,7 +4123,7 @@
           <w:color w:val="auto"/>
           <w:lang w:val="pt-PT"/>
         </w:rPr>
-        <w:t xml:space="preserve"> tendo sido posteriormente aprofundado e melhorado com o objetivo de aplicar conceitos </w:t>
+        <w:t xml:space="preserve"> tendo sido posteriormente aprofundado e melhorado com o objetivo de aplicar conceitos avançados e explorar novas abordagens analíticas. A exploração do Arquivo.pt permitiu não só o desenvolvimento de competências técnicas em áreas como mineração de dados, </w:t>
       </w:r>
       <w:r>
         <w:rPr>
@@ -4179,7 +4132,7 @@
           <w:lang w:val="pt-PT"/>
         </w:rPr>
         <w:lastRenderedPageBreak/>
-        <w:t>avançados e explorar novas abordagens analíticas. A exploração do Arquivo.pt permitiu não só o desenvolvimento de competências técnicas em áreas como mineração de dados, processamento de linguagem natural e visualização de informação, como também revelou o potencial desta ferramenta enquanto recurso acessível e útil para quem pretende dar os primeiros passos na área da Ciência de Dados.</w:t>
+        <w:t>processamento de linguagem natural e visualização de informação, como também revelou o potencial desta ferramenta enquanto recurso acessível e útil para quem pretende dar os primeiros passos na área da Ciência de Dados.</w:t>
       </w:r>
     </w:p>
     <w:p>
@@ -4354,7 +4307,23 @@
           <w:color w:val="auto"/>
           <w:lang w:val="pt-PT"/>
         </w:rPr>
-        <w:t>da aplicação web.</w:t>
+        <w:t xml:space="preserve">da aplicação </w:t>
+      </w:r>
+      <w:r>
+        <w:rPr>
+          <w:i/>
+          <w:color w:val="auto"/>
+          <w:lang w:val="pt-PT"/>
+        </w:rPr>
+        <w:t>web</w:t>
+      </w:r>
+      <w:r>
+        <w:rPr>
+          <w:iCs/>
+          <w:color w:val="auto"/>
+          <w:lang w:val="pt-PT"/>
+        </w:rPr>
+        <w:t>.</w:t>
       </w:r>
     </w:p>
     <w:p>
@@ -4587,95 +4556,9 @@
           <w:color w:val="auto"/>
           <w:lang w:val="pt-PT"/>
         </w:rPr>
-        <w:t xml:space="preserve">Fonte dos dados do projeto, </w:t>
+        <w:t xml:space="preserve">API do Arquivo.pt, </w:t>
       </w:r>
       <w:hyperlink r:id="rId22" w:history="1">
-        <w:r>
-          <w:rPr>
-            <w:rStyle w:val="Hyperlink"/>
-            <w:iCs/>
-            <w:lang w:val="pt-PT"/>
-          </w:rPr>
-          <w:t>https://arquivo.pt</w:t>
-        </w:r>
-      </w:hyperlink>
-    </w:p>
-    <w:p>
-      <w:pPr>
-        <w:ind w:left="360" w:firstLine="0"/>
-        <w:jc w:val="both"/>
-        <w:rPr>
-          <w:iCs/>
-          <w:color w:val="auto"/>
-          <w:lang w:val="pt-PT"/>
-        </w:rPr>
-      </w:pPr>
-      <w:r>
-        <w:rPr>
-          <w:iCs/>
-          <w:color w:val="auto"/>
-          <w:lang w:val="pt-PT"/>
-        </w:rPr>
-        <w:t xml:space="preserve">Arquivo da </w:t>
-      </w:r>
-      <w:r>
-        <w:rPr>
-          <w:i/>
-          <w:color w:val="auto"/>
-          <w:lang w:val="pt-PT"/>
-        </w:rPr>
-        <w:t>web</w:t>
-      </w:r>
-      <w:r>
-        <w:rPr>
-          <w:i/>
-          <w:color w:val="auto"/>
-          <w:lang w:val="pt-PT"/>
-        </w:rPr>
-        <w:t xml:space="preserve"> </w:t>
-      </w:r>
-      <w:r>
-        <w:rPr>
-          <w:iCs/>
-          <w:color w:val="auto"/>
-          <w:lang w:val="pt-PT"/>
-        </w:rPr>
-        <w:t>portuguesa, utilizado como principal fonte de dados para o projeto.</w:t>
-      </w:r>
-    </w:p>
-    <w:p>
-      <w:pPr>
-        <w:ind w:left="360" w:firstLine="0"/>
-        <w:jc w:val="both"/>
-        <w:rPr>
-          <w:iCs/>
-          <w:color w:val="auto"/>
-          <w:lang w:val="pt-PT"/>
-        </w:rPr>
-      </w:pPr>
-    </w:p>
-    <w:p>
-      <w:pPr>
-        <w:numPr>
-          <w:ilvl w:val="0"/>
-          <w:numId w:val="3"/>
-        </w:numPr>
-        <w:jc w:val="both"/>
-        <w:rPr>
-          <w:iCs/>
-          <w:color w:val="auto"/>
-          <w:lang w:val="pt-PT"/>
-        </w:rPr>
-      </w:pPr>
-      <w:r>
-        <w:rPr>
-          <w:iCs/>
-          <w:color w:val="auto"/>
-          <w:lang w:val="pt-PT"/>
-        </w:rPr>
-        <w:t xml:space="preserve">API do Arquivo.pt, </w:t>
-      </w:r>
-      <w:hyperlink r:id="rId23" w:history="1">
         <w:r>
           <w:rPr>
             <w:rStyle w:val="Hyperlink"/>
@@ -4753,7 +4636,7 @@
         </w:rPr>
         <w:t xml:space="preserve">, </w:t>
       </w:r>
-      <w:hyperlink r:id="rId24" w:history="1">
+      <w:hyperlink r:id="rId23" w:history="1">
         <w:r>
           <w:rPr>
             <w:rStyle w:val="Hyperlink"/>
@@ -4780,7 +4663,55 @@
           <w:color w:val="auto"/>
           <w:lang w:val="pt-PT"/>
         </w:rPr>
-        <w:t xml:space="preserve">Coleção de listas de palavras em português, útil para tarefas de processamento de linguagem natural (PLN), como filtragem de </w:t>
+        <w:t>Coleção de listas de palavras em português</w:t>
+      </w:r>
+      <w:r>
+        <w:rPr>
+          <w:iCs/>
+          <w:color w:val="auto"/>
+          <w:lang w:val="pt-PT"/>
+        </w:rPr>
+        <w:t xml:space="preserve"> (</w:t>
+      </w:r>
+      <w:r>
+        <w:rPr>
+          <w:i/>
+          <w:color w:val="auto"/>
+          <w:lang w:val="pt-PT"/>
+        </w:rPr>
+        <w:t>wordlist-preao-20220621.txt.xz</w:t>
+      </w:r>
+      <w:r>
+        <w:rPr>
+          <w:iCs/>
+          <w:color w:val="auto"/>
+          <w:lang w:val="pt-PT"/>
+        </w:rPr>
+        <w:t>)</w:t>
+      </w:r>
+      <w:r>
+        <w:rPr>
+          <w:iCs/>
+          <w:color w:val="auto"/>
+          <w:lang w:val="pt-PT"/>
+        </w:rPr>
+        <w:t>, útil para tarefas de processamento de linguagem natural</w:t>
+      </w:r>
+      <w:r>
+        <w:rPr>
+          <w:iCs/>
+          <w:color w:val="auto"/>
+          <w:lang w:val="pt-PT"/>
+        </w:rPr>
+        <w:t xml:space="preserve">, </w:t>
+      </w:r>
+      <w:r>
+        <w:rPr>
+          <w:iCs/>
+          <w:color w:val="auto"/>
+          <w:lang w:val="pt-PT"/>
+        </w:rPr>
+        <w:t xml:space="preserve">como filtragem de </w:t>
       </w:r>
       <w:proofErr w:type="spellStart"/>
       <w:r>
@@ -4798,31 +4729,15 @@
           <w:color w:val="auto"/>
           <w:lang w:val="pt-PT"/>
         </w:rPr>
-        <w:t xml:space="preserve">, lematização, </w:t>
-      </w:r>
-      <w:r>
-        <w:rPr>
-          <w:iCs/>
-          <w:color w:val="auto"/>
-          <w:lang w:val="pt-PT"/>
-        </w:rPr>
-        <w:t>entre outras.</w:t>
-      </w:r>
-      <w:r>
-        <w:rPr>
-          <w:iCs/>
-          <w:color w:val="auto"/>
-          <w:lang w:val="pt-PT"/>
-        </w:rPr>
-        <w:t xml:space="preserve"> A lista usada foi </w:t>
-      </w:r>
-      <w:r>
-        <w:rPr>
-          <w:i/>
-          <w:color w:val="auto"/>
-          <w:lang w:val="pt-PT"/>
-        </w:rPr>
-        <w:t>wordlist-preao-20220621.txt.xz</w:t>
+        <w:t xml:space="preserve"> e </w:t>
+      </w:r>
+      <w:r>
+        <w:rPr>
+          <w:iCs/>
+          <w:color w:val="auto"/>
+          <w:lang w:val="pt-PT"/>
+        </w:rPr>
+        <w:t>lematização</w:t>
       </w:r>
       <w:r>
         <w:rPr>
@@ -4834,10 +4749,10 @@
       </w:r>
     </w:p>
     <w:sectPr>
-      <w:headerReference w:type="default" r:id="rId25"/>
-      <w:footerReference w:type="default" r:id="rId26"/>
-      <w:headerReference w:type="first" r:id="rId27"/>
-      <w:footerReference w:type="first" r:id="rId28"/>
+      <w:headerReference w:type="default" r:id="rId24"/>
+      <w:footerReference w:type="default" r:id="rId25"/>
+      <w:headerReference w:type="first" r:id="rId26"/>
+      <w:footerReference w:type="first" r:id="rId27"/>
       <w:pgSz w:w="12240" w:h="15840"/>
       <w:pgMar w:top="1440" w:right="1440" w:bottom="1440" w:left="1440" w:header="0" w:footer="720" w:gutter="0"/>
       <w:pgNumType w:start="1"/>

</xml_diff>